<commit_message>
Editing and adding references
</commit_message>
<xml_diff>
--- a/submission/manuscript.docx
+++ b/submission/manuscript.docx
@@ -2,7 +2,7 @@
 <file path=word/document.xml><?xml version="1.0" encoding="utf-8"?>
 <w:document xmlns:w="http://schemas.openxmlformats.org/wordprocessingml/2006/main" xmlns:m="http://schemas.openxmlformats.org/officeDocument/2006/math" xmlns:r="http://schemas.openxmlformats.org/officeDocument/2006/relationships" xmlns:o="urn:schemas-microsoft-com:office:office" xmlns:v="urn:schemas-microsoft-com:vml" xmlns:w10="urn:schemas-microsoft-com:office:word" xmlns:a="http://schemas.openxmlformats.org/drawingml/2006/main" xmlns:pic="http://schemas.openxmlformats.org/drawingml/2006/picture" xmlns:wp="http://schemas.openxmlformats.org/drawingml/2006/wordprocessingDrawing">
   <w:body>
-    <w:bookmarkStart w:id="25" w:name="X147610e92ac754c4050f171fdd6a9a777e65938"/>
+    <w:bookmarkStart w:id="38" w:name="X147610e92ac754c4050f171fdd6a9a777e65938"/>
     <w:p>
       <w:pPr>
         <w:pStyle w:val="Heading1"/>
@@ -124,55 +124,43 @@
         <w:pStyle w:val="FirstParagraph"/>
       </w:pPr>
       <w:r>
-        <w:t xml:space="preserve">Amplicon sequencing projects including 16S rRNA gene sequence collections are widely used by microbiologists to analyze diverse microbiomes. These datasets are often large and complicated making it difficult for researchers to keep their data organized and record the provenance of derivative data products. A long-standing difficulty for many has been the ability to move data between different analytical tools. This often requires reformatting data, which is challenging for researchers with limited programming skills. Several efforts have been made to facilitate the management of amplicon sequencing data and their associated metadata including the biom file format [</w:t>
-      </w:r>
-      <w:r>
-        <w:rPr>
-          <w:b/>
-          <w:bCs/>
-          <w:i/>
-          <w:iCs/>
-        </w:rPr>
-        <w:t xml:space="preserve">ref</w:t>
-      </w:r>
-      <w:r>
-        <w:t xml:space="preserve">], mothur output files [</w:t>
-      </w:r>
-      <w:r>
-        <w:rPr>
-          <w:b/>
-          <w:bCs/>
-          <w:i/>
-          <w:iCs/>
-        </w:rPr>
-        <w:t xml:space="preserve">ref</w:t>
-      </w:r>
-      <w:r>
-        <w:t xml:space="preserve">], the qiime2 archive [</w:t>
-      </w:r>
-      <w:r>
-        <w:rPr>
-          <w:b/>
-          <w:bCs/>
-          <w:i/>
-          <w:iCs/>
-        </w:rPr>
-        <w:t xml:space="preserve">ref</w:t>
-      </w:r>
-      <w:r>
-        <w:t xml:space="preserve">], and phyloseq R objects [</w:t>
-      </w:r>
-      <w:r>
-        <w:rPr>
-          <w:b/>
-          <w:bCs/>
-          <w:i/>
-          <w:iCs/>
-        </w:rPr>
-        <w:t xml:space="preserve">ref</w:t>
-      </w:r>
-      <w:r>
-        <w:t xml:space="preserve">]. Each of these formats and tools have strengths but also limitations that make their use difficult for researchers new to microbiome data analysis or who are more accustomed to using R’s tidyverse collection of packages.</w:t>
+        <w:t xml:space="preserve">Amplicon sequencing projects including 16S rRNA gene sequence collections are widely used by microbiologists to analyze diverse microbiomes. These datasets are often large and complicated making it difficult for researchers to keep their data organized and record the provenance of derivative data products. A long-standing difficulty for many has been the ability to move data between different analytical tools. This often requires reformatting data, which is challenging for researchers with limited programming skills. Several efforts have been made to facilitate the management of amplicon sequencing data and their associated metadata including the biom file format</w:t>
+      </w:r>
+      <w:r>
+        <w:t xml:space="preserve"> </w:t>
+      </w:r>
+      <w:r>
+        <w:t xml:space="preserve">(1)</w:t>
+      </w:r>
+      <w:r>
+        <w:t xml:space="preserve">, mothur output files</w:t>
+      </w:r>
+      <w:r>
+        <w:t xml:space="preserve"> </w:t>
+      </w:r>
+      <w:r>
+        <w:t xml:space="preserve">(2)</w:t>
+      </w:r>
+      <w:r>
+        <w:t xml:space="preserve">, the qiime2 archive</w:t>
+      </w:r>
+      <w:r>
+        <w:t xml:space="preserve"> </w:t>
+      </w:r>
+      <w:r>
+        <w:t xml:space="preserve">(3)</w:t>
+      </w:r>
+      <w:r>
+        <w:t xml:space="preserve">, and phyloseq R objects</w:t>
+      </w:r>
+      <w:r>
+        <w:t xml:space="preserve"> </w:t>
+      </w:r>
+      <w:r>
+        <w:t xml:space="preserve">(4)</w:t>
+      </w:r>
+      <w:r>
+        <w:t xml:space="preserve">. Each of these formats and tools have strengths but also limitations that make their use difficult for researchers new to microbiome data analysis or who are more accustomed to using R’s tidyverse collection of packages.</w:t>
       </w:r>
     </w:p>
     <w:p>
@@ -188,67 +176,52 @@
         <w:pStyle w:val="BodyText"/>
       </w:pPr>
       <w:r>
-        <w:t xml:space="preserve">strollur’s data structures allows users to keep track of aligned and unaligned sequence data, sequencing quality data, abundance data, classification data, phylogenetic trees, operational taxonomic unit (OTU) and amplicon sequence variant (ASV) assignments, and metadata. Furthermore, the data structures can accommodate information describing the commands that generated the data products and information about the databases that were used. The package includes user-facing functions for getting, assigning, and summarizing various forms of data. The package also provides functions to read data from or write data to mothur [</w:t>
-      </w:r>
-      <w:r>
-        <w:rPr>
-          <w:b/>
-          <w:bCs/>
-          <w:i/>
-          <w:iCs/>
-        </w:rPr>
-        <w:t xml:space="preserve">ref</w:t>
-      </w:r>
-      <w:r>
-        <w:t xml:space="preserve">], qiime2 [</w:t>
-      </w:r>
-      <w:r>
-        <w:rPr>
-          <w:b/>
-          <w:bCs/>
-          <w:i/>
-          <w:iCs/>
-        </w:rPr>
-        <w:t xml:space="preserve">ref</w:t>
-      </w:r>
-      <w:r>
-        <w:t xml:space="preserve">], dada2 [</w:t>
-      </w:r>
-      <w:r>
-        <w:rPr>
-          <w:b/>
-          <w:bCs/>
-          <w:i/>
-          <w:iCs/>
-        </w:rPr>
-        <w:t xml:space="preserve">ref</w:t>
-      </w:r>
-      <w:r>
-        <w:t xml:space="preserve">], phyloseq [</w:t>
-      </w:r>
-      <w:r>
-        <w:rPr>
-          <w:b/>
-          <w:bCs/>
-          <w:i/>
-          <w:iCs/>
-        </w:rPr>
-        <w:t xml:space="preserve">ref</w:t>
-      </w:r>
-      <w:r>
-        <w:t xml:space="preserve">], and biom formats [</w:t>
-      </w:r>
-      <w:r>
-        <w:rPr>
-          <w:b/>
-          <w:bCs/>
-          <w:i/>
-          <w:iCs/>
-        </w:rPr>
-        <w:t xml:space="preserve">ref</w:t>
-      </w:r>
-      <w:r>
-        <w:t xml:space="preserve">]. strollur can be used on any operating system with no additional dependencies.</w:t>
+        <w:t xml:space="preserve">strollur’s data structures allows users to keep track of sequence data, abundance data, classification data, phylogenetic trees, operational taxonomic unit (OTU) and amplicon sequence variant (ASV) assignments, reports from different processing steps, and sample metadata. Furthermore, the data structures can accommodate information describing the commands that generated the data products and information about the databases that were used. The package includes user-facing functions for getting, assigning, and summarizing various forms of data. The package also provides functions to read data from or write data to other popular formats including mothur</w:t>
+      </w:r>
+      <w:r>
+        <w:t xml:space="preserve"> </w:t>
+      </w:r>
+      <w:r>
+        <w:t xml:space="preserve">(2)</w:t>
+      </w:r>
+      <w:r>
+        <w:t xml:space="preserve">, qiime2</w:t>
+      </w:r>
+      <w:r>
+        <w:t xml:space="preserve"> </w:t>
+      </w:r>
+      <w:r>
+        <w:t xml:space="preserve">(3)</w:t>
+      </w:r>
+      <w:r>
+        <w:t xml:space="preserve">, dada2</w:t>
+      </w:r>
+      <w:r>
+        <w:t xml:space="preserve"> </w:t>
+      </w:r>
+      <w:r>
+        <w:t xml:space="preserve">(5)</w:t>
+      </w:r>
+      <w:r>
+        <w:t xml:space="preserve">, phyloseq</w:t>
+      </w:r>
+      <w:r>
+        <w:t xml:space="preserve"> </w:t>
+      </w:r>
+      <w:r>
+        <w:t xml:space="preserve">(4)</w:t>
+      </w:r>
+      <w:r>
+        <w:t xml:space="preserve">, and biom</w:t>
+      </w:r>
+      <w:r>
+        <w:t xml:space="preserve"> </w:t>
+      </w:r>
+      <w:r>
+        <w:t xml:space="preserve">(1)</w:t>
+      </w:r>
+      <w:r>
+        <w:t xml:space="preserve">. strollur can be used on any operating system with no additional dependencies.</w:t>
       </w:r>
     </w:p>
     <w:p>
@@ -256,7 +229,31 @@
         <w:pStyle w:val="BodyText"/>
       </w:pPr>
       <w:r>
-        <w:t xml:space="preserve">strollur also includes functions designed for developers to integrate strollur objects into their own R packages. These developer-facing functions provide additional access to the back end data. The ability to import and export data as a strollur object has already been integrated into the clustur, phylotypr, and rchime packages. The package leverages the R6 object oriented programming framework and the Rcpp package to accelerate data processing. By using these features of R, strollur minimize the need to create deep copies of large data objects.</w:t>
+        <w:t xml:space="preserve">strollur also includes functions designed for developers to integrate strollur objects into their own R packages. These developer-facing functions provide additional access to the back end data. The ability to import and export data as a strollur object has already been integrated into the clustur</w:t>
+      </w:r>
+      <w:r>
+        <w:t xml:space="preserve"> </w:t>
+      </w:r>
+      <w:r>
+        <w:t xml:space="preserve">(6)</w:t>
+      </w:r>
+      <w:r>
+        <w:t xml:space="preserve"> </w:t>
+      </w:r>
+      <w:r>
+        <w:t xml:space="preserve">and phylotypr</w:t>
+      </w:r>
+      <w:r>
+        <w:t xml:space="preserve"> </w:t>
+      </w:r>
+      <w:r>
+        <w:t xml:space="preserve">(7)</w:t>
+      </w:r>
+      <w:r>
+        <w:t xml:space="preserve"> </w:t>
+      </w:r>
+      <w:r>
+        <w:t xml:space="preserve">packages. The package leverages the R6 object oriented programming framework and the Rcpp package to accelerate data processing. By using these features of R, strollur minimize the need to create deep copies of large data objects.</w:t>
       </w:r>
     </w:p>
     <w:p>
@@ -274,41 +271,2245 @@
         <w:t xml:space="preserve"> </w:t>
       </w:r>
       <w:r>
-        <w:t xml:space="preserve">strollur can accessed through the Comprehensive R Archive Network (CRAN; DOI: 10.32614/CRAN.package.strollur) and developmental versions are available through the project’s GitHub website (https://github.com/mothur2/strollur). The package’s GitHub repository includes the package’s source code, the website’s source code, automated tests written using the testthat R package, and an issue tracker where users can post questions, bug reports, and suggestions for future features. A pkgdown version of the documentation including multiple articles describing its use is hosted at (https://mothur.org/strollur). The strollur package is available under the MIT License.</w:t>
+        <w:t xml:space="preserve">strollur can accessed through the Comprehensive R Archive Network (CRAN; DOI: 10.32614/CRAN.package.strollur) and developmental versions are available through the project’s GitHub website (https://github.com/mothur2/strollur). The package’s GitHub repository includes the package’s source code, the website’s source code, automated tests written using the testthat R package, and an issue tracker where users can post questions, bug reports, and suggestions for future features. A pkgdown version of the documentation including multiple articles describing its use is hosted at (https://mothur.org/strollur). The strollur package is available under the GNU General Public License (v3).</w:t>
       </w:r>
     </w:p>
     <w:bookmarkEnd w:id="21"/>
-    <w:bookmarkStart w:id="22" w:name="acknowledgements"/>
+    <w:bookmarkStart w:id="37" w:name="references"/>
     <w:p>
       <w:pPr>
         <w:pStyle w:val="Heading2"/>
       </w:pPr>
       <w:r>
-        <w:t xml:space="preserve">Acknowledgements</w:t>
+        <w:t xml:space="preserve">References</w:t>
       </w:r>
     </w:p>
+    <w:bookmarkStart w:id="36" w:name="refs"/>
+    <w:bookmarkStart w:id="23" w:name="ref-McDonald2012"/>
     <w:p>
       <w:pPr>
-        <w:pStyle w:val="FirstParagraph"/>
+        <w:pStyle w:val="Bibliography"/>
       </w:pPr>
       <w:r>
-        <w:t xml:space="preserve">This project was supported, in part, by …</w:t>
+        <w:t xml:space="preserve">1.</w:t>
+      </w:r>
+      <w:r>
+        <w:t xml:space="preserve"> </w:t>
+      </w:r>
+      <w:r>
+        <w:t xml:space="preserve">	</w:t>
+      </w:r>
+      <w:r>
+        <w:rPr>
+          <w:b/>
+          <w:bCs/>
+        </w:rPr>
+        <w:t xml:space="preserve">McDonald D</w:t>
+      </w:r>
+      <w:r>
+        <w:t xml:space="preserve">,</w:t>
+      </w:r>
+      <w:r>
+        <w:t xml:space="preserve"> </w:t>
+      </w:r>
+      <w:r>
+        <w:rPr>
+          <w:b/>
+          <w:bCs/>
+        </w:rPr>
+        <w:t xml:space="preserve">Clemente JC</w:t>
+      </w:r>
+      <w:r>
+        <w:t xml:space="preserve">,</w:t>
+      </w:r>
+      <w:r>
+        <w:t xml:space="preserve"> </w:t>
+      </w:r>
+      <w:r>
+        <w:rPr>
+          <w:b/>
+          <w:bCs/>
+        </w:rPr>
+        <w:t xml:space="preserve">Kuczynski J</w:t>
+      </w:r>
+      <w:r>
+        <w:t xml:space="preserve">,</w:t>
+      </w:r>
+      <w:r>
+        <w:t xml:space="preserve"> </w:t>
+      </w:r>
+      <w:r>
+        <w:rPr>
+          <w:b/>
+          <w:bCs/>
+        </w:rPr>
+        <w:t xml:space="preserve">Rideout JR</w:t>
+      </w:r>
+      <w:r>
+        <w:t xml:space="preserve">,</w:t>
+      </w:r>
+      <w:r>
+        <w:t xml:space="preserve"> </w:t>
+      </w:r>
+      <w:r>
+        <w:rPr>
+          <w:b/>
+          <w:bCs/>
+        </w:rPr>
+        <w:t xml:space="preserve">Stombaugh J</w:t>
+      </w:r>
+      <w:r>
+        <w:t xml:space="preserve">,</w:t>
+      </w:r>
+      <w:r>
+        <w:t xml:space="preserve"> </w:t>
+      </w:r>
+      <w:r>
+        <w:rPr>
+          <w:b/>
+          <w:bCs/>
+        </w:rPr>
+        <w:t xml:space="preserve">Wendel D</w:t>
+      </w:r>
+      <w:r>
+        <w:t xml:space="preserve">,</w:t>
+      </w:r>
+      <w:r>
+        <w:t xml:space="preserve"> </w:t>
+      </w:r>
+      <w:r>
+        <w:rPr>
+          <w:b/>
+          <w:bCs/>
+        </w:rPr>
+        <w:t xml:space="preserve">Wilke A</w:t>
+      </w:r>
+      <w:r>
+        <w:t xml:space="preserve">,</w:t>
+      </w:r>
+      <w:r>
+        <w:t xml:space="preserve"> </w:t>
+      </w:r>
+      <w:r>
+        <w:rPr>
+          <w:b/>
+          <w:bCs/>
+        </w:rPr>
+        <w:t xml:space="preserve">Huse S</w:t>
+      </w:r>
+      <w:r>
+        <w:t xml:space="preserve">,</w:t>
+      </w:r>
+      <w:r>
+        <w:t xml:space="preserve"> </w:t>
+      </w:r>
+      <w:r>
+        <w:rPr>
+          <w:b/>
+          <w:bCs/>
+        </w:rPr>
+        <w:t xml:space="preserve">Hufnagle J</w:t>
+      </w:r>
+      <w:r>
+        <w:t xml:space="preserve">,</w:t>
+      </w:r>
+      <w:r>
+        <w:t xml:space="preserve"> </w:t>
+      </w:r>
+      <w:r>
+        <w:rPr>
+          <w:b/>
+          <w:bCs/>
+        </w:rPr>
+        <w:t xml:space="preserve">Meyer F</w:t>
+      </w:r>
+      <w:r>
+        <w:t xml:space="preserve">,</w:t>
+      </w:r>
+      <w:r>
+        <w:t xml:space="preserve"> </w:t>
+      </w:r>
+      <w:r>
+        <w:rPr>
+          <w:b/>
+          <w:bCs/>
+        </w:rPr>
+        <w:t xml:space="preserve">Knight R</w:t>
+      </w:r>
+      <w:r>
+        <w:t xml:space="preserve">,</w:t>
+      </w:r>
+      <w:r>
+        <w:t xml:space="preserve"> </w:t>
+      </w:r>
+      <w:r>
+        <w:rPr>
+          <w:b/>
+          <w:bCs/>
+        </w:rPr>
+        <w:t xml:space="preserve">Caporaso JG</w:t>
+      </w:r>
+      <w:r>
+        <w:t xml:space="preserve">. 2012. The biological observation matrix (BIOM) format or: How i learned to stop worrying and love the ome-ome. GigaScience</w:t>
+      </w:r>
+      <w:r>
+        <w:t xml:space="preserve"> </w:t>
+      </w:r>
+      <w:r>
+        <w:rPr>
+          <w:b/>
+          <w:bCs/>
+        </w:rPr>
+        <w:t xml:space="preserve">1</w:t>
+      </w:r>
+      <w:r>
+        <w:t xml:space="preserve">. doi:</w:t>
+      </w:r>
+      <w:hyperlink r:id="rId22">
+        <w:r>
+          <w:rPr>
+            <w:rStyle w:val="Hyperlink"/>
+          </w:rPr>
+          <w:t xml:space="preserve">10.1186/2047-217x-1-7</w:t>
+        </w:r>
+      </w:hyperlink>
+      <w:r>
+        <w:t xml:space="preserve">.</w:t>
       </w:r>
     </w:p>
-    <w:bookmarkEnd w:id="22"/>
-    <w:bookmarkStart w:id="24" w:name="references"/>
+    <w:bookmarkEnd w:id="23"/>
+    <w:bookmarkStart w:id="25" w:name="ref-Schloss2009"/>
     <w:p>
       <w:pPr>
-        <w:pStyle w:val="Heading2"/>
+        <w:pStyle w:val="Bibliography"/>
       </w:pPr>
       <w:r>
-        <w:t xml:space="preserve">References</w:t>
+        <w:t xml:space="preserve">2.</w:t>
+      </w:r>
+      <w:r>
+        <w:t xml:space="preserve"> </w:t>
+      </w:r>
+      <w:r>
+        <w:t xml:space="preserve">	</w:t>
+      </w:r>
+      <w:r>
+        <w:rPr>
+          <w:b/>
+          <w:bCs/>
+        </w:rPr>
+        <w:t xml:space="preserve">Schloss PD</w:t>
+      </w:r>
+      <w:r>
+        <w:t xml:space="preserve">,</w:t>
+      </w:r>
+      <w:r>
+        <w:t xml:space="preserve"> </w:t>
+      </w:r>
+      <w:r>
+        <w:rPr>
+          <w:b/>
+          <w:bCs/>
+        </w:rPr>
+        <w:t xml:space="preserve">Westcott SL</w:t>
+      </w:r>
+      <w:r>
+        <w:t xml:space="preserve">,</w:t>
+      </w:r>
+      <w:r>
+        <w:t xml:space="preserve"> </w:t>
+      </w:r>
+      <w:r>
+        <w:rPr>
+          <w:b/>
+          <w:bCs/>
+        </w:rPr>
+        <w:t xml:space="preserve">Ryabin T</w:t>
+      </w:r>
+      <w:r>
+        <w:t xml:space="preserve">,</w:t>
+      </w:r>
+      <w:r>
+        <w:t xml:space="preserve"> </w:t>
+      </w:r>
+      <w:r>
+        <w:rPr>
+          <w:b/>
+          <w:bCs/>
+        </w:rPr>
+        <w:t xml:space="preserve">Hall JR</w:t>
+      </w:r>
+      <w:r>
+        <w:t xml:space="preserve">,</w:t>
+      </w:r>
+      <w:r>
+        <w:t xml:space="preserve"> </w:t>
+      </w:r>
+      <w:r>
+        <w:rPr>
+          <w:b/>
+          <w:bCs/>
+        </w:rPr>
+        <w:t xml:space="preserve">Hartmann M</w:t>
+      </w:r>
+      <w:r>
+        <w:t xml:space="preserve">,</w:t>
+      </w:r>
+      <w:r>
+        <w:t xml:space="preserve"> </w:t>
+      </w:r>
+      <w:r>
+        <w:rPr>
+          <w:b/>
+          <w:bCs/>
+        </w:rPr>
+        <w:t xml:space="preserve">Hollister EB</w:t>
+      </w:r>
+      <w:r>
+        <w:t xml:space="preserve">,</w:t>
+      </w:r>
+      <w:r>
+        <w:t xml:space="preserve"> </w:t>
+      </w:r>
+      <w:r>
+        <w:rPr>
+          <w:b/>
+          <w:bCs/>
+        </w:rPr>
+        <w:t xml:space="preserve">Lesniewski RA</w:t>
+      </w:r>
+      <w:r>
+        <w:t xml:space="preserve">,</w:t>
+      </w:r>
+      <w:r>
+        <w:t xml:space="preserve"> </w:t>
+      </w:r>
+      <w:r>
+        <w:rPr>
+          <w:b/>
+          <w:bCs/>
+        </w:rPr>
+        <w:t xml:space="preserve">Oakley BB</w:t>
+      </w:r>
+      <w:r>
+        <w:t xml:space="preserve">,</w:t>
+      </w:r>
+      <w:r>
+        <w:t xml:space="preserve"> </w:t>
+      </w:r>
+      <w:r>
+        <w:rPr>
+          <w:b/>
+          <w:bCs/>
+        </w:rPr>
+        <w:t xml:space="preserve">Parks DH</w:t>
+      </w:r>
+      <w:r>
+        <w:t xml:space="preserve">,</w:t>
+      </w:r>
+      <w:r>
+        <w:t xml:space="preserve"> </w:t>
+      </w:r>
+      <w:r>
+        <w:rPr>
+          <w:b/>
+          <w:bCs/>
+        </w:rPr>
+        <w:t xml:space="preserve">Robinson CJ</w:t>
+      </w:r>
+      <w:r>
+        <w:t xml:space="preserve">,</w:t>
+      </w:r>
+      <w:r>
+        <w:t xml:space="preserve"> </w:t>
+      </w:r>
+      <w:r>
+        <w:rPr>
+          <w:b/>
+          <w:bCs/>
+        </w:rPr>
+        <w:t xml:space="preserve">Sahl JW</w:t>
+      </w:r>
+      <w:r>
+        <w:t xml:space="preserve">,</w:t>
+      </w:r>
+      <w:r>
+        <w:t xml:space="preserve"> </w:t>
+      </w:r>
+      <w:r>
+        <w:rPr>
+          <w:b/>
+          <w:bCs/>
+        </w:rPr>
+        <w:t xml:space="preserve">Stres B</w:t>
+      </w:r>
+      <w:r>
+        <w:t xml:space="preserve">,</w:t>
+      </w:r>
+      <w:r>
+        <w:t xml:space="preserve"> </w:t>
+      </w:r>
+      <w:r>
+        <w:rPr>
+          <w:b/>
+          <w:bCs/>
+        </w:rPr>
+        <w:t xml:space="preserve">Thallinger GG</w:t>
+      </w:r>
+      <w:r>
+        <w:t xml:space="preserve">,</w:t>
+      </w:r>
+      <w:r>
+        <w:t xml:space="preserve"> </w:t>
+      </w:r>
+      <w:r>
+        <w:rPr>
+          <w:b/>
+          <w:bCs/>
+        </w:rPr>
+        <w:t xml:space="preserve">Van Horn DJ</w:t>
+      </w:r>
+      <w:r>
+        <w:t xml:space="preserve">,</w:t>
+      </w:r>
+      <w:r>
+        <w:t xml:space="preserve"> </w:t>
+      </w:r>
+      <w:r>
+        <w:rPr>
+          <w:b/>
+          <w:bCs/>
+        </w:rPr>
+        <w:t xml:space="preserve">Weber CF</w:t>
+      </w:r>
+      <w:r>
+        <w:t xml:space="preserve">. 2009. Introducing mothur: Open-source, platform-independent, community-supported software for describing and comparing microbial communities. Applied and Environmental Microbiology</w:t>
+      </w:r>
+      <w:r>
+        <w:t xml:space="preserve"> </w:t>
+      </w:r>
+      <w:r>
+        <w:rPr>
+          <w:b/>
+          <w:bCs/>
+        </w:rPr>
+        <w:t xml:space="preserve">75</w:t>
+      </w:r>
+      <w:r>
+        <w:t xml:space="preserve">:7537–7541. doi:</w:t>
+      </w:r>
+      <w:hyperlink r:id="rId24">
+        <w:r>
+          <w:rPr>
+            <w:rStyle w:val="Hyperlink"/>
+          </w:rPr>
+          <w:t xml:space="preserve">10.1128/aem.01541-09</w:t>
+        </w:r>
+      </w:hyperlink>
+      <w:r>
+        <w:t xml:space="preserve">.</w:t>
       </w:r>
     </w:p>
-    <w:bookmarkStart w:id="23" w:name="refs"/>
-    <w:bookmarkEnd w:id="23"/>
-    <w:bookmarkEnd w:id="24"/>
     <w:bookmarkEnd w:id="25"/>
+    <w:bookmarkStart w:id="27" w:name="ref-Bolyen2019"/>
+    <w:p>
+      <w:pPr>
+        <w:pStyle w:val="Bibliography"/>
+      </w:pPr>
+      <w:r>
+        <w:t xml:space="preserve">3.</w:t>
+      </w:r>
+      <w:r>
+        <w:t xml:space="preserve"> </w:t>
+      </w:r>
+      <w:r>
+        <w:t xml:space="preserve">	</w:t>
+      </w:r>
+      <w:r>
+        <w:rPr>
+          <w:b/>
+          <w:bCs/>
+        </w:rPr>
+        <w:t xml:space="preserve">Bolyen E</w:t>
+      </w:r>
+      <w:r>
+        <w:t xml:space="preserve">,</w:t>
+      </w:r>
+      <w:r>
+        <w:t xml:space="preserve"> </w:t>
+      </w:r>
+      <w:r>
+        <w:rPr>
+          <w:b/>
+          <w:bCs/>
+        </w:rPr>
+        <w:t xml:space="preserve">Rideout JR</w:t>
+      </w:r>
+      <w:r>
+        <w:t xml:space="preserve">,</w:t>
+      </w:r>
+      <w:r>
+        <w:t xml:space="preserve"> </w:t>
+      </w:r>
+      <w:r>
+        <w:rPr>
+          <w:b/>
+          <w:bCs/>
+        </w:rPr>
+        <w:t xml:space="preserve">Dillon MR</w:t>
+      </w:r>
+      <w:r>
+        <w:t xml:space="preserve">,</w:t>
+      </w:r>
+      <w:r>
+        <w:t xml:space="preserve"> </w:t>
+      </w:r>
+      <w:r>
+        <w:rPr>
+          <w:b/>
+          <w:bCs/>
+        </w:rPr>
+        <w:t xml:space="preserve">Bokulich NA</w:t>
+      </w:r>
+      <w:r>
+        <w:t xml:space="preserve">,</w:t>
+      </w:r>
+      <w:r>
+        <w:t xml:space="preserve"> </w:t>
+      </w:r>
+      <w:r>
+        <w:rPr>
+          <w:b/>
+          <w:bCs/>
+        </w:rPr>
+        <w:t xml:space="preserve">Abnet CC</w:t>
+      </w:r>
+      <w:r>
+        <w:t xml:space="preserve">,</w:t>
+      </w:r>
+      <w:r>
+        <w:t xml:space="preserve"> </w:t>
+      </w:r>
+      <w:r>
+        <w:rPr>
+          <w:b/>
+          <w:bCs/>
+        </w:rPr>
+        <w:t xml:space="preserve">Al-Ghalith GA</w:t>
+      </w:r>
+      <w:r>
+        <w:t xml:space="preserve">,</w:t>
+      </w:r>
+      <w:r>
+        <w:t xml:space="preserve"> </w:t>
+      </w:r>
+      <w:r>
+        <w:rPr>
+          <w:b/>
+          <w:bCs/>
+        </w:rPr>
+        <w:t xml:space="preserve">Alexander H</w:t>
+      </w:r>
+      <w:r>
+        <w:t xml:space="preserve">,</w:t>
+      </w:r>
+      <w:r>
+        <w:t xml:space="preserve"> </w:t>
+      </w:r>
+      <w:r>
+        <w:rPr>
+          <w:b/>
+          <w:bCs/>
+        </w:rPr>
+        <w:t xml:space="preserve">Alm EJ</w:t>
+      </w:r>
+      <w:r>
+        <w:t xml:space="preserve">,</w:t>
+      </w:r>
+      <w:r>
+        <w:t xml:space="preserve"> </w:t>
+      </w:r>
+      <w:r>
+        <w:rPr>
+          <w:b/>
+          <w:bCs/>
+        </w:rPr>
+        <w:t xml:space="preserve">Arumugam M</w:t>
+      </w:r>
+      <w:r>
+        <w:t xml:space="preserve">,</w:t>
+      </w:r>
+      <w:r>
+        <w:t xml:space="preserve"> </w:t>
+      </w:r>
+      <w:r>
+        <w:rPr>
+          <w:b/>
+          <w:bCs/>
+        </w:rPr>
+        <w:t xml:space="preserve">Asnicar F</w:t>
+      </w:r>
+      <w:r>
+        <w:t xml:space="preserve">,</w:t>
+      </w:r>
+      <w:r>
+        <w:t xml:space="preserve"> </w:t>
+      </w:r>
+      <w:r>
+        <w:rPr>
+          <w:b/>
+          <w:bCs/>
+        </w:rPr>
+        <w:t xml:space="preserve">Bai Y</w:t>
+      </w:r>
+      <w:r>
+        <w:t xml:space="preserve">,</w:t>
+      </w:r>
+      <w:r>
+        <w:t xml:space="preserve"> </w:t>
+      </w:r>
+      <w:r>
+        <w:rPr>
+          <w:b/>
+          <w:bCs/>
+        </w:rPr>
+        <w:t xml:space="preserve">Bisanz JE</w:t>
+      </w:r>
+      <w:r>
+        <w:t xml:space="preserve">,</w:t>
+      </w:r>
+      <w:r>
+        <w:t xml:space="preserve"> </w:t>
+      </w:r>
+      <w:r>
+        <w:rPr>
+          <w:b/>
+          <w:bCs/>
+        </w:rPr>
+        <w:t xml:space="preserve">Bittinger K</w:t>
+      </w:r>
+      <w:r>
+        <w:t xml:space="preserve">,</w:t>
+      </w:r>
+      <w:r>
+        <w:t xml:space="preserve"> </w:t>
+      </w:r>
+      <w:r>
+        <w:rPr>
+          <w:b/>
+          <w:bCs/>
+        </w:rPr>
+        <w:t xml:space="preserve">Brejnrod A</w:t>
+      </w:r>
+      <w:r>
+        <w:t xml:space="preserve">,</w:t>
+      </w:r>
+      <w:r>
+        <w:t xml:space="preserve"> </w:t>
+      </w:r>
+      <w:r>
+        <w:rPr>
+          <w:b/>
+          <w:bCs/>
+        </w:rPr>
+        <w:t xml:space="preserve">Brislawn CJ</w:t>
+      </w:r>
+      <w:r>
+        <w:t xml:space="preserve">,</w:t>
+      </w:r>
+      <w:r>
+        <w:t xml:space="preserve"> </w:t>
+      </w:r>
+      <w:r>
+        <w:rPr>
+          <w:b/>
+          <w:bCs/>
+        </w:rPr>
+        <w:t xml:space="preserve">Brown CT</w:t>
+      </w:r>
+      <w:r>
+        <w:t xml:space="preserve">,</w:t>
+      </w:r>
+      <w:r>
+        <w:t xml:space="preserve"> </w:t>
+      </w:r>
+      <w:r>
+        <w:rPr>
+          <w:b/>
+          <w:bCs/>
+        </w:rPr>
+        <w:t xml:space="preserve">Callahan BJ</w:t>
+      </w:r>
+      <w:r>
+        <w:t xml:space="preserve">,</w:t>
+      </w:r>
+      <w:r>
+        <w:t xml:space="preserve"> </w:t>
+      </w:r>
+      <w:r>
+        <w:rPr>
+          <w:b/>
+          <w:bCs/>
+        </w:rPr>
+        <w:t xml:space="preserve">Caraballo-Rodríguez AM</w:t>
+      </w:r>
+      <w:r>
+        <w:t xml:space="preserve">,</w:t>
+      </w:r>
+      <w:r>
+        <w:t xml:space="preserve"> </w:t>
+      </w:r>
+      <w:r>
+        <w:rPr>
+          <w:b/>
+          <w:bCs/>
+        </w:rPr>
+        <w:t xml:space="preserve">Chase J</w:t>
+      </w:r>
+      <w:r>
+        <w:t xml:space="preserve">,</w:t>
+      </w:r>
+      <w:r>
+        <w:t xml:space="preserve"> </w:t>
+      </w:r>
+      <w:r>
+        <w:rPr>
+          <w:b/>
+          <w:bCs/>
+        </w:rPr>
+        <w:t xml:space="preserve">Cope EK</w:t>
+      </w:r>
+      <w:r>
+        <w:t xml:space="preserve">,</w:t>
+      </w:r>
+      <w:r>
+        <w:t xml:space="preserve"> </w:t>
+      </w:r>
+      <w:r>
+        <w:rPr>
+          <w:b/>
+          <w:bCs/>
+        </w:rPr>
+        <w:t xml:space="preserve">Da Silva R</w:t>
+      </w:r>
+      <w:r>
+        <w:t xml:space="preserve">,</w:t>
+      </w:r>
+      <w:r>
+        <w:t xml:space="preserve"> </w:t>
+      </w:r>
+      <w:r>
+        <w:rPr>
+          <w:b/>
+          <w:bCs/>
+        </w:rPr>
+        <w:t xml:space="preserve">Diener C</w:t>
+      </w:r>
+      <w:r>
+        <w:t xml:space="preserve">,</w:t>
+      </w:r>
+      <w:r>
+        <w:t xml:space="preserve"> </w:t>
+      </w:r>
+      <w:r>
+        <w:rPr>
+          <w:b/>
+          <w:bCs/>
+        </w:rPr>
+        <w:t xml:space="preserve">Dorrestein PC</w:t>
+      </w:r>
+      <w:r>
+        <w:t xml:space="preserve">,</w:t>
+      </w:r>
+      <w:r>
+        <w:t xml:space="preserve"> </w:t>
+      </w:r>
+      <w:r>
+        <w:rPr>
+          <w:b/>
+          <w:bCs/>
+        </w:rPr>
+        <w:t xml:space="preserve">Douglas GM</w:t>
+      </w:r>
+      <w:r>
+        <w:t xml:space="preserve">,</w:t>
+      </w:r>
+      <w:r>
+        <w:t xml:space="preserve"> </w:t>
+      </w:r>
+      <w:r>
+        <w:rPr>
+          <w:b/>
+          <w:bCs/>
+        </w:rPr>
+        <w:t xml:space="preserve">Durall DM</w:t>
+      </w:r>
+      <w:r>
+        <w:t xml:space="preserve">,</w:t>
+      </w:r>
+      <w:r>
+        <w:t xml:space="preserve"> </w:t>
+      </w:r>
+      <w:r>
+        <w:rPr>
+          <w:b/>
+          <w:bCs/>
+        </w:rPr>
+        <w:t xml:space="preserve">Duvallet C</w:t>
+      </w:r>
+      <w:r>
+        <w:t xml:space="preserve">,</w:t>
+      </w:r>
+      <w:r>
+        <w:t xml:space="preserve"> </w:t>
+      </w:r>
+      <w:r>
+        <w:rPr>
+          <w:b/>
+          <w:bCs/>
+        </w:rPr>
+        <w:t xml:space="preserve">Edwardson CF</w:t>
+      </w:r>
+      <w:r>
+        <w:t xml:space="preserve">,</w:t>
+      </w:r>
+      <w:r>
+        <w:t xml:space="preserve"> </w:t>
+      </w:r>
+      <w:r>
+        <w:rPr>
+          <w:b/>
+          <w:bCs/>
+        </w:rPr>
+        <w:t xml:space="preserve">Ernst M</w:t>
+      </w:r>
+      <w:r>
+        <w:t xml:space="preserve">,</w:t>
+      </w:r>
+      <w:r>
+        <w:t xml:space="preserve"> </w:t>
+      </w:r>
+      <w:r>
+        <w:rPr>
+          <w:b/>
+          <w:bCs/>
+        </w:rPr>
+        <w:t xml:space="preserve">Estaki M</w:t>
+      </w:r>
+      <w:r>
+        <w:t xml:space="preserve">,</w:t>
+      </w:r>
+      <w:r>
+        <w:t xml:space="preserve"> </w:t>
+      </w:r>
+      <w:r>
+        <w:rPr>
+          <w:b/>
+          <w:bCs/>
+        </w:rPr>
+        <w:t xml:space="preserve">Fouquier J</w:t>
+      </w:r>
+      <w:r>
+        <w:t xml:space="preserve">,</w:t>
+      </w:r>
+      <w:r>
+        <w:t xml:space="preserve"> </w:t>
+      </w:r>
+      <w:r>
+        <w:rPr>
+          <w:b/>
+          <w:bCs/>
+        </w:rPr>
+        <w:t xml:space="preserve">Gauglitz JM</w:t>
+      </w:r>
+      <w:r>
+        <w:t xml:space="preserve">,</w:t>
+      </w:r>
+      <w:r>
+        <w:t xml:space="preserve"> </w:t>
+      </w:r>
+      <w:r>
+        <w:rPr>
+          <w:b/>
+          <w:bCs/>
+        </w:rPr>
+        <w:t xml:space="preserve">Gibbons SM</w:t>
+      </w:r>
+      <w:r>
+        <w:t xml:space="preserve">,</w:t>
+      </w:r>
+      <w:r>
+        <w:t xml:space="preserve"> </w:t>
+      </w:r>
+      <w:r>
+        <w:rPr>
+          <w:b/>
+          <w:bCs/>
+        </w:rPr>
+        <w:t xml:space="preserve">Gibson DL</w:t>
+      </w:r>
+      <w:r>
+        <w:t xml:space="preserve">,</w:t>
+      </w:r>
+      <w:r>
+        <w:t xml:space="preserve"> </w:t>
+      </w:r>
+      <w:r>
+        <w:rPr>
+          <w:b/>
+          <w:bCs/>
+        </w:rPr>
+        <w:t xml:space="preserve">Gonzalez A</w:t>
+      </w:r>
+      <w:r>
+        <w:t xml:space="preserve">,</w:t>
+      </w:r>
+      <w:r>
+        <w:t xml:space="preserve"> </w:t>
+      </w:r>
+      <w:r>
+        <w:rPr>
+          <w:b/>
+          <w:bCs/>
+        </w:rPr>
+        <w:t xml:space="preserve">Gorlick K</w:t>
+      </w:r>
+      <w:r>
+        <w:t xml:space="preserve">,</w:t>
+      </w:r>
+      <w:r>
+        <w:t xml:space="preserve"> </w:t>
+      </w:r>
+      <w:r>
+        <w:rPr>
+          <w:b/>
+          <w:bCs/>
+        </w:rPr>
+        <w:t xml:space="preserve">Guo J</w:t>
+      </w:r>
+      <w:r>
+        <w:t xml:space="preserve">,</w:t>
+      </w:r>
+      <w:r>
+        <w:t xml:space="preserve"> </w:t>
+      </w:r>
+      <w:r>
+        <w:rPr>
+          <w:b/>
+          <w:bCs/>
+        </w:rPr>
+        <w:t xml:space="preserve">Hillmann B</w:t>
+      </w:r>
+      <w:r>
+        <w:t xml:space="preserve">,</w:t>
+      </w:r>
+      <w:r>
+        <w:t xml:space="preserve"> </w:t>
+      </w:r>
+      <w:r>
+        <w:rPr>
+          <w:b/>
+          <w:bCs/>
+        </w:rPr>
+        <w:t xml:space="preserve">Holmes S</w:t>
+      </w:r>
+      <w:r>
+        <w:t xml:space="preserve">,</w:t>
+      </w:r>
+      <w:r>
+        <w:t xml:space="preserve"> </w:t>
+      </w:r>
+      <w:r>
+        <w:rPr>
+          <w:b/>
+          <w:bCs/>
+        </w:rPr>
+        <w:t xml:space="preserve">Holste H</w:t>
+      </w:r>
+      <w:r>
+        <w:t xml:space="preserve">,</w:t>
+      </w:r>
+      <w:r>
+        <w:t xml:space="preserve"> </w:t>
+      </w:r>
+      <w:r>
+        <w:rPr>
+          <w:b/>
+          <w:bCs/>
+        </w:rPr>
+        <w:t xml:space="preserve">Huttenhower C</w:t>
+      </w:r>
+      <w:r>
+        <w:t xml:space="preserve">,</w:t>
+      </w:r>
+      <w:r>
+        <w:t xml:space="preserve"> </w:t>
+      </w:r>
+      <w:r>
+        <w:rPr>
+          <w:b/>
+          <w:bCs/>
+        </w:rPr>
+        <w:t xml:space="preserve">Huttley GA</w:t>
+      </w:r>
+      <w:r>
+        <w:t xml:space="preserve">,</w:t>
+      </w:r>
+      <w:r>
+        <w:t xml:space="preserve"> </w:t>
+      </w:r>
+      <w:r>
+        <w:rPr>
+          <w:b/>
+          <w:bCs/>
+        </w:rPr>
+        <w:t xml:space="preserve">Janssen S</w:t>
+      </w:r>
+      <w:r>
+        <w:t xml:space="preserve">,</w:t>
+      </w:r>
+      <w:r>
+        <w:t xml:space="preserve"> </w:t>
+      </w:r>
+      <w:r>
+        <w:rPr>
+          <w:b/>
+          <w:bCs/>
+        </w:rPr>
+        <w:t xml:space="preserve">Jarmusch AK</w:t>
+      </w:r>
+      <w:r>
+        <w:t xml:space="preserve">,</w:t>
+      </w:r>
+      <w:r>
+        <w:t xml:space="preserve"> </w:t>
+      </w:r>
+      <w:r>
+        <w:rPr>
+          <w:b/>
+          <w:bCs/>
+        </w:rPr>
+        <w:t xml:space="preserve">Jiang L</w:t>
+      </w:r>
+      <w:r>
+        <w:t xml:space="preserve">,</w:t>
+      </w:r>
+      <w:r>
+        <w:t xml:space="preserve"> </w:t>
+      </w:r>
+      <w:r>
+        <w:rPr>
+          <w:b/>
+          <w:bCs/>
+        </w:rPr>
+        <w:t xml:space="preserve">Kaehler BD</w:t>
+      </w:r>
+      <w:r>
+        <w:t xml:space="preserve">,</w:t>
+      </w:r>
+      <w:r>
+        <w:t xml:space="preserve"> </w:t>
+      </w:r>
+      <w:r>
+        <w:rPr>
+          <w:b/>
+          <w:bCs/>
+        </w:rPr>
+        <w:t xml:space="preserve">Kang KB</w:t>
+      </w:r>
+      <w:r>
+        <w:t xml:space="preserve">,</w:t>
+      </w:r>
+      <w:r>
+        <w:t xml:space="preserve"> </w:t>
+      </w:r>
+      <w:r>
+        <w:rPr>
+          <w:b/>
+          <w:bCs/>
+        </w:rPr>
+        <w:t xml:space="preserve">Keefe CR</w:t>
+      </w:r>
+      <w:r>
+        <w:t xml:space="preserve">,</w:t>
+      </w:r>
+      <w:r>
+        <w:t xml:space="preserve"> </w:t>
+      </w:r>
+      <w:r>
+        <w:rPr>
+          <w:b/>
+          <w:bCs/>
+        </w:rPr>
+        <w:t xml:space="preserve">Keim P</w:t>
+      </w:r>
+      <w:r>
+        <w:t xml:space="preserve">,</w:t>
+      </w:r>
+      <w:r>
+        <w:t xml:space="preserve"> </w:t>
+      </w:r>
+      <w:r>
+        <w:rPr>
+          <w:b/>
+          <w:bCs/>
+        </w:rPr>
+        <w:t xml:space="preserve">Kelley ST</w:t>
+      </w:r>
+      <w:r>
+        <w:t xml:space="preserve">,</w:t>
+      </w:r>
+      <w:r>
+        <w:t xml:space="preserve"> </w:t>
+      </w:r>
+      <w:r>
+        <w:rPr>
+          <w:b/>
+          <w:bCs/>
+        </w:rPr>
+        <w:t xml:space="preserve">Knights D</w:t>
+      </w:r>
+      <w:r>
+        <w:t xml:space="preserve">,</w:t>
+      </w:r>
+      <w:r>
+        <w:t xml:space="preserve"> </w:t>
+      </w:r>
+      <w:r>
+        <w:rPr>
+          <w:b/>
+          <w:bCs/>
+        </w:rPr>
+        <w:t xml:space="preserve">Koester I</w:t>
+      </w:r>
+      <w:r>
+        <w:t xml:space="preserve">,</w:t>
+      </w:r>
+      <w:r>
+        <w:t xml:space="preserve"> </w:t>
+      </w:r>
+      <w:r>
+        <w:rPr>
+          <w:b/>
+          <w:bCs/>
+        </w:rPr>
+        <w:t xml:space="preserve">Kosciolek T</w:t>
+      </w:r>
+      <w:r>
+        <w:t xml:space="preserve">,</w:t>
+      </w:r>
+      <w:r>
+        <w:t xml:space="preserve"> </w:t>
+      </w:r>
+      <w:r>
+        <w:rPr>
+          <w:b/>
+          <w:bCs/>
+        </w:rPr>
+        <w:t xml:space="preserve">Kreps J</w:t>
+      </w:r>
+      <w:r>
+        <w:t xml:space="preserve">,</w:t>
+      </w:r>
+      <w:r>
+        <w:t xml:space="preserve"> </w:t>
+      </w:r>
+      <w:r>
+        <w:rPr>
+          <w:b/>
+          <w:bCs/>
+        </w:rPr>
+        <w:t xml:space="preserve">Langille MGI</w:t>
+      </w:r>
+      <w:r>
+        <w:t xml:space="preserve">,</w:t>
+      </w:r>
+      <w:r>
+        <w:t xml:space="preserve"> </w:t>
+      </w:r>
+      <w:r>
+        <w:rPr>
+          <w:b/>
+          <w:bCs/>
+        </w:rPr>
+        <w:t xml:space="preserve">Lee J</w:t>
+      </w:r>
+      <w:r>
+        <w:t xml:space="preserve">,</w:t>
+      </w:r>
+      <w:r>
+        <w:t xml:space="preserve"> </w:t>
+      </w:r>
+      <w:r>
+        <w:rPr>
+          <w:b/>
+          <w:bCs/>
+        </w:rPr>
+        <w:t xml:space="preserve">Ley R</w:t>
+      </w:r>
+      <w:r>
+        <w:t xml:space="preserve">,</w:t>
+      </w:r>
+      <w:r>
+        <w:t xml:space="preserve"> </w:t>
+      </w:r>
+      <w:r>
+        <w:rPr>
+          <w:b/>
+          <w:bCs/>
+        </w:rPr>
+        <w:t xml:space="preserve">Liu Y-X</w:t>
+      </w:r>
+      <w:r>
+        <w:t xml:space="preserve">,</w:t>
+      </w:r>
+      <w:r>
+        <w:t xml:space="preserve"> </w:t>
+      </w:r>
+      <w:r>
+        <w:rPr>
+          <w:b/>
+          <w:bCs/>
+        </w:rPr>
+        <w:t xml:space="preserve">Loftfield E</w:t>
+      </w:r>
+      <w:r>
+        <w:t xml:space="preserve">,</w:t>
+      </w:r>
+      <w:r>
+        <w:t xml:space="preserve"> </w:t>
+      </w:r>
+      <w:r>
+        <w:rPr>
+          <w:b/>
+          <w:bCs/>
+        </w:rPr>
+        <w:t xml:space="preserve">Lozupone C</w:t>
+      </w:r>
+      <w:r>
+        <w:t xml:space="preserve">,</w:t>
+      </w:r>
+      <w:r>
+        <w:t xml:space="preserve"> </w:t>
+      </w:r>
+      <w:r>
+        <w:rPr>
+          <w:b/>
+          <w:bCs/>
+        </w:rPr>
+        <w:t xml:space="preserve">Maher M</w:t>
+      </w:r>
+      <w:r>
+        <w:t xml:space="preserve">,</w:t>
+      </w:r>
+      <w:r>
+        <w:t xml:space="preserve"> </w:t>
+      </w:r>
+      <w:r>
+        <w:rPr>
+          <w:b/>
+          <w:bCs/>
+        </w:rPr>
+        <w:t xml:space="preserve">Marotz C</w:t>
+      </w:r>
+      <w:r>
+        <w:t xml:space="preserve">,</w:t>
+      </w:r>
+      <w:r>
+        <w:t xml:space="preserve"> </w:t>
+      </w:r>
+      <w:r>
+        <w:rPr>
+          <w:b/>
+          <w:bCs/>
+        </w:rPr>
+        <w:t xml:space="preserve">Martin BD</w:t>
+      </w:r>
+      <w:r>
+        <w:t xml:space="preserve">,</w:t>
+      </w:r>
+      <w:r>
+        <w:t xml:space="preserve"> </w:t>
+      </w:r>
+      <w:r>
+        <w:rPr>
+          <w:b/>
+          <w:bCs/>
+        </w:rPr>
+        <w:t xml:space="preserve">McDonald D</w:t>
+      </w:r>
+      <w:r>
+        <w:t xml:space="preserve">,</w:t>
+      </w:r>
+      <w:r>
+        <w:t xml:space="preserve"> </w:t>
+      </w:r>
+      <w:r>
+        <w:rPr>
+          <w:b/>
+          <w:bCs/>
+        </w:rPr>
+        <w:t xml:space="preserve">McIver LJ</w:t>
+      </w:r>
+      <w:r>
+        <w:t xml:space="preserve">,</w:t>
+      </w:r>
+      <w:r>
+        <w:t xml:space="preserve"> </w:t>
+      </w:r>
+      <w:r>
+        <w:rPr>
+          <w:b/>
+          <w:bCs/>
+        </w:rPr>
+        <w:t xml:space="preserve">Melnik AV</w:t>
+      </w:r>
+      <w:r>
+        <w:t xml:space="preserve">,</w:t>
+      </w:r>
+      <w:r>
+        <w:t xml:space="preserve"> </w:t>
+      </w:r>
+      <w:r>
+        <w:rPr>
+          <w:b/>
+          <w:bCs/>
+        </w:rPr>
+        <w:t xml:space="preserve">Metcalf JL</w:t>
+      </w:r>
+      <w:r>
+        <w:t xml:space="preserve">,</w:t>
+      </w:r>
+      <w:r>
+        <w:t xml:space="preserve"> </w:t>
+      </w:r>
+      <w:r>
+        <w:rPr>
+          <w:b/>
+          <w:bCs/>
+        </w:rPr>
+        <w:t xml:space="preserve">Morgan SC</w:t>
+      </w:r>
+      <w:r>
+        <w:t xml:space="preserve">,</w:t>
+      </w:r>
+      <w:r>
+        <w:t xml:space="preserve"> </w:t>
+      </w:r>
+      <w:r>
+        <w:rPr>
+          <w:b/>
+          <w:bCs/>
+        </w:rPr>
+        <w:t xml:space="preserve">Morton JT</w:t>
+      </w:r>
+      <w:r>
+        <w:t xml:space="preserve">,</w:t>
+      </w:r>
+      <w:r>
+        <w:t xml:space="preserve"> </w:t>
+      </w:r>
+      <w:r>
+        <w:rPr>
+          <w:b/>
+          <w:bCs/>
+        </w:rPr>
+        <w:t xml:space="preserve">Naimey AT</w:t>
+      </w:r>
+      <w:r>
+        <w:t xml:space="preserve">,</w:t>
+      </w:r>
+      <w:r>
+        <w:t xml:space="preserve"> </w:t>
+      </w:r>
+      <w:r>
+        <w:rPr>
+          <w:b/>
+          <w:bCs/>
+        </w:rPr>
+        <w:t xml:space="preserve">Navas-Molina JA</w:t>
+      </w:r>
+      <w:r>
+        <w:t xml:space="preserve">,</w:t>
+      </w:r>
+      <w:r>
+        <w:t xml:space="preserve"> </w:t>
+      </w:r>
+      <w:r>
+        <w:rPr>
+          <w:b/>
+          <w:bCs/>
+        </w:rPr>
+        <w:t xml:space="preserve">Nothias LF</w:t>
+      </w:r>
+      <w:r>
+        <w:t xml:space="preserve">,</w:t>
+      </w:r>
+      <w:r>
+        <w:t xml:space="preserve"> </w:t>
+      </w:r>
+      <w:r>
+        <w:rPr>
+          <w:b/>
+          <w:bCs/>
+        </w:rPr>
+        <w:t xml:space="preserve">Orchanian SB</w:t>
+      </w:r>
+      <w:r>
+        <w:t xml:space="preserve">,</w:t>
+      </w:r>
+      <w:r>
+        <w:t xml:space="preserve"> </w:t>
+      </w:r>
+      <w:r>
+        <w:rPr>
+          <w:b/>
+          <w:bCs/>
+        </w:rPr>
+        <w:t xml:space="preserve">Pearson T</w:t>
+      </w:r>
+      <w:r>
+        <w:t xml:space="preserve">,</w:t>
+      </w:r>
+      <w:r>
+        <w:t xml:space="preserve"> </w:t>
+      </w:r>
+      <w:r>
+        <w:rPr>
+          <w:b/>
+          <w:bCs/>
+        </w:rPr>
+        <w:t xml:space="preserve">Peoples SL</w:t>
+      </w:r>
+      <w:r>
+        <w:t xml:space="preserve">,</w:t>
+      </w:r>
+      <w:r>
+        <w:t xml:space="preserve"> </w:t>
+      </w:r>
+      <w:r>
+        <w:rPr>
+          <w:b/>
+          <w:bCs/>
+        </w:rPr>
+        <w:t xml:space="preserve">Petras D</w:t>
+      </w:r>
+      <w:r>
+        <w:t xml:space="preserve">,</w:t>
+      </w:r>
+      <w:r>
+        <w:t xml:space="preserve"> </w:t>
+      </w:r>
+      <w:r>
+        <w:rPr>
+          <w:b/>
+          <w:bCs/>
+        </w:rPr>
+        <w:t xml:space="preserve">Preuss ML</w:t>
+      </w:r>
+      <w:r>
+        <w:t xml:space="preserve">,</w:t>
+      </w:r>
+      <w:r>
+        <w:t xml:space="preserve"> </w:t>
+      </w:r>
+      <w:r>
+        <w:rPr>
+          <w:b/>
+          <w:bCs/>
+        </w:rPr>
+        <w:t xml:space="preserve">Pruesse E</w:t>
+      </w:r>
+      <w:r>
+        <w:t xml:space="preserve">,</w:t>
+      </w:r>
+      <w:r>
+        <w:t xml:space="preserve"> </w:t>
+      </w:r>
+      <w:r>
+        <w:rPr>
+          <w:b/>
+          <w:bCs/>
+        </w:rPr>
+        <w:t xml:space="preserve">Rasmussen LB</w:t>
+      </w:r>
+      <w:r>
+        <w:t xml:space="preserve">,</w:t>
+      </w:r>
+      <w:r>
+        <w:t xml:space="preserve"> </w:t>
+      </w:r>
+      <w:r>
+        <w:rPr>
+          <w:b/>
+          <w:bCs/>
+        </w:rPr>
+        <w:t xml:space="preserve">Rivers A</w:t>
+      </w:r>
+      <w:r>
+        <w:t xml:space="preserve">,</w:t>
+      </w:r>
+      <w:r>
+        <w:t xml:space="preserve"> </w:t>
+      </w:r>
+      <w:r>
+        <w:rPr>
+          <w:b/>
+          <w:bCs/>
+        </w:rPr>
+        <w:t xml:space="preserve">Robeson MS</w:t>
+      </w:r>
+      <w:r>
+        <w:t xml:space="preserve">,</w:t>
+      </w:r>
+      <w:r>
+        <w:t xml:space="preserve"> </w:t>
+      </w:r>
+      <w:r>
+        <w:rPr>
+          <w:b/>
+          <w:bCs/>
+        </w:rPr>
+        <w:t xml:space="preserve">Rosenthal P</w:t>
+      </w:r>
+      <w:r>
+        <w:t xml:space="preserve">,</w:t>
+      </w:r>
+      <w:r>
+        <w:t xml:space="preserve"> </w:t>
+      </w:r>
+      <w:r>
+        <w:rPr>
+          <w:b/>
+          <w:bCs/>
+        </w:rPr>
+        <w:t xml:space="preserve">Segata N</w:t>
+      </w:r>
+      <w:r>
+        <w:t xml:space="preserve">,</w:t>
+      </w:r>
+      <w:r>
+        <w:t xml:space="preserve"> </w:t>
+      </w:r>
+      <w:r>
+        <w:rPr>
+          <w:b/>
+          <w:bCs/>
+        </w:rPr>
+        <w:t xml:space="preserve">Shaffer M</w:t>
+      </w:r>
+      <w:r>
+        <w:t xml:space="preserve">,</w:t>
+      </w:r>
+      <w:r>
+        <w:t xml:space="preserve"> </w:t>
+      </w:r>
+      <w:r>
+        <w:rPr>
+          <w:b/>
+          <w:bCs/>
+        </w:rPr>
+        <w:t xml:space="preserve">Shiffer A</w:t>
+      </w:r>
+      <w:r>
+        <w:t xml:space="preserve">,</w:t>
+      </w:r>
+      <w:r>
+        <w:t xml:space="preserve"> </w:t>
+      </w:r>
+      <w:r>
+        <w:rPr>
+          <w:b/>
+          <w:bCs/>
+        </w:rPr>
+        <w:t xml:space="preserve">Sinha R</w:t>
+      </w:r>
+      <w:r>
+        <w:t xml:space="preserve">,</w:t>
+      </w:r>
+      <w:r>
+        <w:t xml:space="preserve"> </w:t>
+      </w:r>
+      <w:r>
+        <w:rPr>
+          <w:b/>
+          <w:bCs/>
+        </w:rPr>
+        <w:t xml:space="preserve">Song SJ</w:t>
+      </w:r>
+      <w:r>
+        <w:t xml:space="preserve">,</w:t>
+      </w:r>
+      <w:r>
+        <w:t xml:space="preserve"> </w:t>
+      </w:r>
+      <w:r>
+        <w:rPr>
+          <w:b/>
+          <w:bCs/>
+        </w:rPr>
+        <w:t xml:space="preserve">Spear JR</w:t>
+      </w:r>
+      <w:r>
+        <w:t xml:space="preserve">,</w:t>
+      </w:r>
+      <w:r>
+        <w:t xml:space="preserve"> </w:t>
+      </w:r>
+      <w:r>
+        <w:rPr>
+          <w:b/>
+          <w:bCs/>
+        </w:rPr>
+        <w:t xml:space="preserve">Swafford AD</w:t>
+      </w:r>
+      <w:r>
+        <w:t xml:space="preserve">,</w:t>
+      </w:r>
+      <w:r>
+        <w:t xml:space="preserve"> </w:t>
+      </w:r>
+      <w:r>
+        <w:rPr>
+          <w:b/>
+          <w:bCs/>
+        </w:rPr>
+        <w:t xml:space="preserve">Thompson LR</w:t>
+      </w:r>
+      <w:r>
+        <w:t xml:space="preserve">,</w:t>
+      </w:r>
+      <w:r>
+        <w:t xml:space="preserve"> </w:t>
+      </w:r>
+      <w:r>
+        <w:rPr>
+          <w:b/>
+          <w:bCs/>
+        </w:rPr>
+        <w:t xml:space="preserve">Torres PJ</w:t>
+      </w:r>
+      <w:r>
+        <w:t xml:space="preserve">,</w:t>
+      </w:r>
+      <w:r>
+        <w:t xml:space="preserve"> </w:t>
+      </w:r>
+      <w:r>
+        <w:rPr>
+          <w:b/>
+          <w:bCs/>
+        </w:rPr>
+        <w:t xml:space="preserve">Trinh P</w:t>
+      </w:r>
+      <w:r>
+        <w:t xml:space="preserve">,</w:t>
+      </w:r>
+      <w:r>
+        <w:t xml:space="preserve"> </w:t>
+      </w:r>
+      <w:r>
+        <w:rPr>
+          <w:b/>
+          <w:bCs/>
+        </w:rPr>
+        <w:t xml:space="preserve">Tripathi A</w:t>
+      </w:r>
+      <w:r>
+        <w:t xml:space="preserve">,</w:t>
+      </w:r>
+      <w:r>
+        <w:t xml:space="preserve"> </w:t>
+      </w:r>
+      <w:r>
+        <w:rPr>
+          <w:b/>
+          <w:bCs/>
+        </w:rPr>
+        <w:t xml:space="preserve">Turnbaugh PJ</w:t>
+      </w:r>
+      <w:r>
+        <w:t xml:space="preserve">,</w:t>
+      </w:r>
+      <w:r>
+        <w:t xml:space="preserve"> </w:t>
+      </w:r>
+      <w:r>
+        <w:rPr>
+          <w:b/>
+          <w:bCs/>
+        </w:rPr>
+        <w:t xml:space="preserve">Ul-Hasan S</w:t>
+      </w:r>
+      <w:r>
+        <w:t xml:space="preserve">,</w:t>
+      </w:r>
+      <w:r>
+        <w:t xml:space="preserve"> </w:t>
+      </w:r>
+      <w:r>
+        <w:rPr>
+          <w:b/>
+          <w:bCs/>
+        </w:rPr>
+        <w:t xml:space="preserve">Hooft JJJ van der</w:t>
+      </w:r>
+      <w:r>
+        <w:t xml:space="preserve">,</w:t>
+      </w:r>
+      <w:r>
+        <w:t xml:space="preserve"> </w:t>
+      </w:r>
+      <w:r>
+        <w:rPr>
+          <w:b/>
+          <w:bCs/>
+        </w:rPr>
+        <w:t xml:space="preserve">Vargas F</w:t>
+      </w:r>
+      <w:r>
+        <w:t xml:space="preserve">,</w:t>
+      </w:r>
+      <w:r>
+        <w:t xml:space="preserve"> </w:t>
+      </w:r>
+      <w:r>
+        <w:rPr>
+          <w:b/>
+          <w:bCs/>
+        </w:rPr>
+        <w:t xml:space="preserve">Vázquez-Baeza Y</w:t>
+      </w:r>
+      <w:r>
+        <w:t xml:space="preserve">,</w:t>
+      </w:r>
+      <w:r>
+        <w:t xml:space="preserve"> </w:t>
+      </w:r>
+      <w:r>
+        <w:rPr>
+          <w:b/>
+          <w:bCs/>
+        </w:rPr>
+        <w:t xml:space="preserve">Vogtmann E</w:t>
+      </w:r>
+      <w:r>
+        <w:t xml:space="preserve">,</w:t>
+      </w:r>
+      <w:r>
+        <w:t xml:space="preserve"> </w:t>
+      </w:r>
+      <w:r>
+        <w:rPr>
+          <w:b/>
+          <w:bCs/>
+        </w:rPr>
+        <w:t xml:space="preserve">Hippel M von</w:t>
+      </w:r>
+      <w:r>
+        <w:t xml:space="preserve">,</w:t>
+      </w:r>
+      <w:r>
+        <w:t xml:space="preserve"> </w:t>
+      </w:r>
+      <w:r>
+        <w:rPr>
+          <w:b/>
+          <w:bCs/>
+        </w:rPr>
+        <w:t xml:space="preserve">Walters W</w:t>
+      </w:r>
+      <w:r>
+        <w:t xml:space="preserve">,</w:t>
+      </w:r>
+      <w:r>
+        <w:t xml:space="preserve"> </w:t>
+      </w:r>
+      <w:r>
+        <w:rPr>
+          <w:b/>
+          <w:bCs/>
+        </w:rPr>
+        <w:t xml:space="preserve">Wan Y</w:t>
+      </w:r>
+      <w:r>
+        <w:t xml:space="preserve">,</w:t>
+      </w:r>
+      <w:r>
+        <w:t xml:space="preserve"> </w:t>
+      </w:r>
+      <w:r>
+        <w:rPr>
+          <w:b/>
+          <w:bCs/>
+        </w:rPr>
+        <w:t xml:space="preserve">Wang M</w:t>
+      </w:r>
+      <w:r>
+        <w:t xml:space="preserve">,</w:t>
+      </w:r>
+      <w:r>
+        <w:t xml:space="preserve"> </w:t>
+      </w:r>
+      <w:r>
+        <w:rPr>
+          <w:b/>
+          <w:bCs/>
+        </w:rPr>
+        <w:t xml:space="preserve">Warren J</w:t>
+      </w:r>
+      <w:r>
+        <w:t xml:space="preserve">,</w:t>
+      </w:r>
+      <w:r>
+        <w:t xml:space="preserve"> </w:t>
+      </w:r>
+      <w:r>
+        <w:rPr>
+          <w:b/>
+          <w:bCs/>
+        </w:rPr>
+        <w:t xml:space="preserve">Weber KC</w:t>
+      </w:r>
+      <w:r>
+        <w:t xml:space="preserve">,</w:t>
+      </w:r>
+      <w:r>
+        <w:t xml:space="preserve"> </w:t>
+      </w:r>
+      <w:r>
+        <w:rPr>
+          <w:b/>
+          <w:bCs/>
+        </w:rPr>
+        <w:t xml:space="preserve">Williamson CHD</w:t>
+      </w:r>
+      <w:r>
+        <w:t xml:space="preserve">,</w:t>
+      </w:r>
+      <w:r>
+        <w:t xml:space="preserve"> </w:t>
+      </w:r>
+      <w:r>
+        <w:rPr>
+          <w:b/>
+          <w:bCs/>
+        </w:rPr>
+        <w:t xml:space="preserve">Willis AD</w:t>
+      </w:r>
+      <w:r>
+        <w:t xml:space="preserve">,</w:t>
+      </w:r>
+      <w:r>
+        <w:t xml:space="preserve"> </w:t>
+      </w:r>
+      <w:r>
+        <w:rPr>
+          <w:b/>
+          <w:bCs/>
+        </w:rPr>
+        <w:t xml:space="preserve">Xu ZZ</w:t>
+      </w:r>
+      <w:r>
+        <w:t xml:space="preserve">,</w:t>
+      </w:r>
+      <w:r>
+        <w:t xml:space="preserve"> </w:t>
+      </w:r>
+      <w:r>
+        <w:rPr>
+          <w:b/>
+          <w:bCs/>
+        </w:rPr>
+        <w:t xml:space="preserve">Zaneveld JR</w:t>
+      </w:r>
+      <w:r>
+        <w:t xml:space="preserve">,</w:t>
+      </w:r>
+      <w:r>
+        <w:t xml:space="preserve"> </w:t>
+      </w:r>
+      <w:r>
+        <w:rPr>
+          <w:b/>
+          <w:bCs/>
+        </w:rPr>
+        <w:t xml:space="preserve">Zhang Y</w:t>
+      </w:r>
+      <w:r>
+        <w:t xml:space="preserve">,</w:t>
+      </w:r>
+      <w:r>
+        <w:t xml:space="preserve"> </w:t>
+      </w:r>
+      <w:r>
+        <w:rPr>
+          <w:b/>
+          <w:bCs/>
+        </w:rPr>
+        <w:t xml:space="preserve">Zhu Q</w:t>
+      </w:r>
+      <w:r>
+        <w:t xml:space="preserve">,</w:t>
+      </w:r>
+      <w:r>
+        <w:t xml:space="preserve"> </w:t>
+      </w:r>
+      <w:r>
+        <w:rPr>
+          <w:b/>
+          <w:bCs/>
+        </w:rPr>
+        <w:t xml:space="preserve">Knight R</w:t>
+      </w:r>
+      <w:r>
+        <w:t xml:space="preserve">,</w:t>
+      </w:r>
+      <w:r>
+        <w:t xml:space="preserve"> </w:t>
+      </w:r>
+      <w:r>
+        <w:rPr>
+          <w:b/>
+          <w:bCs/>
+        </w:rPr>
+        <w:t xml:space="preserve">Caporaso JG</w:t>
+      </w:r>
+      <w:r>
+        <w:t xml:space="preserve">. 2019. Reproducible, interactive, scalable and extensible microbiome data science using QIIME 2. Nature Biotechnology</w:t>
+      </w:r>
+      <w:r>
+        <w:t xml:space="preserve"> </w:t>
+      </w:r>
+      <w:r>
+        <w:rPr>
+          <w:b/>
+          <w:bCs/>
+        </w:rPr>
+        <w:t xml:space="preserve">37</w:t>
+      </w:r>
+      <w:r>
+        <w:t xml:space="preserve">:852–857. doi:</w:t>
+      </w:r>
+      <w:hyperlink r:id="rId26">
+        <w:r>
+          <w:rPr>
+            <w:rStyle w:val="Hyperlink"/>
+          </w:rPr>
+          <w:t xml:space="preserve">10.1038/s41587-019-0209-9</w:t>
+        </w:r>
+      </w:hyperlink>
+      <w:r>
+        <w:t xml:space="preserve">.</w:t>
+      </w:r>
+    </w:p>
+    <w:bookmarkEnd w:id="27"/>
+    <w:bookmarkStart w:id="29" w:name="ref-McMurdie2013"/>
+    <w:p>
+      <w:pPr>
+        <w:pStyle w:val="Bibliography"/>
+      </w:pPr>
+      <w:r>
+        <w:t xml:space="preserve">4.</w:t>
+      </w:r>
+      <w:r>
+        <w:t xml:space="preserve"> </w:t>
+      </w:r>
+      <w:r>
+        <w:t xml:space="preserve">	</w:t>
+      </w:r>
+      <w:r>
+        <w:rPr>
+          <w:b/>
+          <w:bCs/>
+        </w:rPr>
+        <w:t xml:space="preserve">McMurdie PJ</w:t>
+      </w:r>
+      <w:r>
+        <w:t xml:space="preserve">,</w:t>
+      </w:r>
+      <w:r>
+        <w:t xml:space="preserve"> </w:t>
+      </w:r>
+      <w:r>
+        <w:rPr>
+          <w:b/>
+          <w:bCs/>
+        </w:rPr>
+        <w:t xml:space="preserve">Holmes S</w:t>
+      </w:r>
+      <w:r>
+        <w:t xml:space="preserve">. 2013. Phyloseq: An r package for reproducible interactive analysis and graphics of microbiome census data. PLoS ONE</w:t>
+      </w:r>
+      <w:r>
+        <w:t xml:space="preserve"> </w:t>
+      </w:r>
+      <w:r>
+        <w:rPr>
+          <w:b/>
+          <w:bCs/>
+        </w:rPr>
+        <w:t xml:space="preserve">8</w:t>
+      </w:r>
+      <w:r>
+        <w:t xml:space="preserve">:e61217. doi:</w:t>
+      </w:r>
+      <w:hyperlink r:id="rId28">
+        <w:r>
+          <w:rPr>
+            <w:rStyle w:val="Hyperlink"/>
+          </w:rPr>
+          <w:t xml:space="preserve">10.1371/journal.pone.0061217</w:t>
+        </w:r>
+      </w:hyperlink>
+      <w:r>
+        <w:t xml:space="preserve">.</w:t>
+      </w:r>
+    </w:p>
+    <w:bookmarkEnd w:id="29"/>
+    <w:bookmarkStart w:id="31" w:name="ref-Callahan2016"/>
+    <w:p>
+      <w:pPr>
+        <w:pStyle w:val="Bibliography"/>
+      </w:pPr>
+      <w:r>
+        <w:t xml:space="preserve">5.</w:t>
+      </w:r>
+      <w:r>
+        <w:t xml:space="preserve"> </w:t>
+      </w:r>
+      <w:r>
+        <w:t xml:space="preserve">	</w:t>
+      </w:r>
+      <w:r>
+        <w:rPr>
+          <w:b/>
+          <w:bCs/>
+        </w:rPr>
+        <w:t xml:space="preserve">Callahan BJ</w:t>
+      </w:r>
+      <w:r>
+        <w:t xml:space="preserve">,</w:t>
+      </w:r>
+      <w:r>
+        <w:t xml:space="preserve"> </w:t>
+      </w:r>
+      <w:r>
+        <w:rPr>
+          <w:b/>
+          <w:bCs/>
+        </w:rPr>
+        <w:t xml:space="preserve">McMurdie PJ</w:t>
+      </w:r>
+      <w:r>
+        <w:t xml:space="preserve">,</w:t>
+      </w:r>
+      <w:r>
+        <w:t xml:space="preserve"> </w:t>
+      </w:r>
+      <w:r>
+        <w:rPr>
+          <w:b/>
+          <w:bCs/>
+        </w:rPr>
+        <w:t xml:space="preserve">Rosen MJ</w:t>
+      </w:r>
+      <w:r>
+        <w:t xml:space="preserve">,</w:t>
+      </w:r>
+      <w:r>
+        <w:t xml:space="preserve"> </w:t>
+      </w:r>
+      <w:r>
+        <w:rPr>
+          <w:b/>
+          <w:bCs/>
+        </w:rPr>
+        <w:t xml:space="preserve">Han AW</w:t>
+      </w:r>
+      <w:r>
+        <w:t xml:space="preserve">,</w:t>
+      </w:r>
+      <w:r>
+        <w:t xml:space="preserve"> </w:t>
+      </w:r>
+      <w:r>
+        <w:rPr>
+          <w:b/>
+          <w:bCs/>
+        </w:rPr>
+        <w:t xml:space="preserve">Johnson AJA</w:t>
+      </w:r>
+      <w:r>
+        <w:t xml:space="preserve">,</w:t>
+      </w:r>
+      <w:r>
+        <w:t xml:space="preserve"> </w:t>
+      </w:r>
+      <w:r>
+        <w:rPr>
+          <w:b/>
+          <w:bCs/>
+        </w:rPr>
+        <w:t xml:space="preserve">Holmes SP</w:t>
+      </w:r>
+      <w:r>
+        <w:t xml:space="preserve">. 2016. DADA2: High-resolution sample inference from illumina amplicon data. Nature Methods</w:t>
+      </w:r>
+      <w:r>
+        <w:t xml:space="preserve"> </w:t>
+      </w:r>
+      <w:r>
+        <w:rPr>
+          <w:b/>
+          <w:bCs/>
+        </w:rPr>
+        <w:t xml:space="preserve">13</w:t>
+      </w:r>
+      <w:r>
+        <w:t xml:space="preserve">:581–583. doi:</w:t>
+      </w:r>
+      <w:hyperlink r:id="rId30">
+        <w:r>
+          <w:rPr>
+            <w:rStyle w:val="Hyperlink"/>
+          </w:rPr>
+          <w:t xml:space="preserve">10.1038/nmeth.3869</w:t>
+        </w:r>
+      </w:hyperlink>
+      <w:r>
+        <w:t xml:space="preserve">.</w:t>
+      </w:r>
+    </w:p>
+    <w:bookmarkEnd w:id="31"/>
+    <w:bookmarkStart w:id="33" w:name="ref-Johnson2025"/>
+    <w:p>
+      <w:pPr>
+        <w:pStyle w:val="Bibliography"/>
+      </w:pPr>
+      <w:r>
+        <w:t xml:space="preserve">6.</w:t>
+      </w:r>
+      <w:r>
+        <w:t xml:space="preserve"> </w:t>
+      </w:r>
+      <w:r>
+        <w:t xml:space="preserve">	</w:t>
+      </w:r>
+      <w:r>
+        <w:rPr>
+          <w:b/>
+          <w:bCs/>
+        </w:rPr>
+        <w:t xml:space="preserve">Johnson G</w:t>
+      </w:r>
+      <w:r>
+        <w:t xml:space="preserve">,</w:t>
+      </w:r>
+      <w:r>
+        <w:t xml:space="preserve"> </w:t>
+      </w:r>
+      <w:r>
+        <w:rPr>
+          <w:b/>
+          <w:bCs/>
+        </w:rPr>
+        <w:t xml:space="preserve">Westcott SL</w:t>
+      </w:r>
+      <w:r>
+        <w:t xml:space="preserve">,</w:t>
+      </w:r>
+      <w:r>
+        <w:t xml:space="preserve"> </w:t>
+      </w:r>
+      <w:r>
+        <w:rPr>
+          <w:b/>
+          <w:bCs/>
+        </w:rPr>
+        <w:t xml:space="preserve">Schloss PD</w:t>
+      </w:r>
+      <w:r>
+        <w:t xml:space="preserve">. 2025. Clustur: An r package for clustering features using sparse distance matrices. Microbiology Resource Announcements</w:t>
+      </w:r>
+      <w:r>
+        <w:t xml:space="preserve"> </w:t>
+      </w:r>
+      <w:r>
+        <w:rPr>
+          <w:b/>
+          <w:bCs/>
+        </w:rPr>
+        <w:t xml:space="preserve">14</w:t>
+      </w:r>
+      <w:r>
+        <w:t xml:space="preserve">. doi:</w:t>
+      </w:r>
+      <w:hyperlink r:id="rId32">
+        <w:r>
+          <w:rPr>
+            <w:rStyle w:val="Hyperlink"/>
+          </w:rPr>
+          <w:t xml:space="preserve">10.1128/mra.01238-24</w:t>
+        </w:r>
+      </w:hyperlink>
+      <w:r>
+        <w:t xml:space="preserve">.</w:t>
+      </w:r>
+    </w:p>
+    <w:bookmarkEnd w:id="33"/>
+    <w:bookmarkStart w:id="35" w:name="ref-Schloss2025"/>
+    <w:p>
+      <w:pPr>
+        <w:pStyle w:val="Bibliography"/>
+      </w:pPr>
+      <w:r>
+        <w:t xml:space="preserve">7.</w:t>
+      </w:r>
+      <w:r>
+        <w:t xml:space="preserve"> </w:t>
+      </w:r>
+      <w:r>
+        <w:t xml:space="preserve">	</w:t>
+      </w:r>
+      <w:r>
+        <w:rPr>
+          <w:b/>
+          <w:bCs/>
+        </w:rPr>
+        <w:t xml:space="preserve">Schloss PD</w:t>
+      </w:r>
+      <w:r>
+        <w:t xml:space="preserve">. 2025. Phylotypr: An r package for classifying DNA sequences. Microbiology Resource Announcements</w:t>
+      </w:r>
+      <w:r>
+        <w:t xml:space="preserve"> </w:t>
+      </w:r>
+      <w:r>
+        <w:rPr>
+          <w:b/>
+          <w:bCs/>
+        </w:rPr>
+        <w:t xml:space="preserve">14</w:t>
+      </w:r>
+      <w:r>
+        <w:t xml:space="preserve">. doi:</w:t>
+      </w:r>
+      <w:hyperlink r:id="rId34">
+        <w:r>
+          <w:rPr>
+            <w:rStyle w:val="Hyperlink"/>
+          </w:rPr>
+          <w:t xml:space="preserve">10.1128/mra.01144-24</w:t>
+        </w:r>
+      </w:hyperlink>
+      <w:r>
+        <w:t xml:space="preserve">.</w:t>
+      </w:r>
+    </w:p>
+    <w:bookmarkEnd w:id="35"/>
+    <w:bookmarkEnd w:id="36"/>
+    <w:bookmarkEnd w:id="37"/>
+    <w:bookmarkEnd w:id="38"/>
     <w:sectPr>
       <w:footnotePr>
         <w:numRestart w:val="eachSect"/>

</xml_diff>